<commit_message>
update resume forpoliio link
</commit_message>
<xml_diff>
--- a/src/assets/Charles_Palencia_Resume.docx
+++ b/src/assets/Charles_Palencia_Resume.docx
@@ -73,7 +73,23 @@
             <w:sz w:val="12"/>
             <w:szCs w:val="12"/>
           </w:rPr>
-          <w:t>https://charrlesss.github.io/charles-portfolio/</w:t>
+          <w:t>https://portfolio-gjihg2w7k-charrles</w:t>
+        </w:r>
+        <w:r>
+          <w:rPr>
+            <w:rStyle w:val="Hyperlink"/>
+            <w:sz w:val="12"/>
+            <w:szCs w:val="12"/>
+          </w:rPr>
+          <w:t>s</w:t>
+        </w:r>
+        <w:r>
+          <w:rPr>
+            <w:rStyle w:val="Hyperlink"/>
+            <w:sz w:val="12"/>
+            <w:szCs w:val="12"/>
+          </w:rPr>
+          <w:t>s-projects.vercel.app/</w:t>
         </w:r>
       </w:hyperlink>
       <w:r>
@@ -3687,6 +3703,30 @@
       <w:u w:val="single"/>
     </w:rPr>
   </w:style>
+  <w:style w:type="character" w:styleId="UnresolvedMention">
+    <w:name w:val="Unresolved Mention"/>
+    <w:basedOn w:val="DefaultParagraphFont"/>
+    <w:uiPriority w:val="99"/>
+    <w:semiHidden/>
+    <w:unhideWhenUsed/>
+    <w:rsid w:val="00715066"/>
+    <w:rPr>
+      <w:color w:val="605E5C"/>
+      <w:shd w:val="clear" w:color="auto" w:fill="E1DFDD"/>
+    </w:rPr>
+  </w:style>
+  <w:style w:type="character" w:styleId="FollowedHyperlink">
+    <w:name w:val="FollowedHyperlink"/>
+    <w:basedOn w:val="DefaultParagraphFont"/>
+    <w:uiPriority w:val="99"/>
+    <w:semiHidden/>
+    <w:unhideWhenUsed/>
+    <w:rsid w:val="00715066"/>
+    <w:rPr>
+      <w:color w:val="96607D" w:themeColor="followedHyperlink"/>
+      <w:u w:val="single"/>
+    </w:rPr>
+  </w:style>
 </w:styles>
 </file>
 

</xml_diff>